<commit_message>
docs: add MY PROJECTS coexistence gap to home round 2 QA
Item #4 (MY BOARDS) shipped, but the portal still renders MY PROJECTS
underneath it, listing all 12 active projects with no curation. Our
build has only MY BOARDS — the favoriting model is the whole point of
that section, and MY PROJECTS undermines it because users see
everything regardless of what they pin.

Added as item #7 [MED] OPEN [NEW]: remove MY PROJECTS, optionally
surface a 'see all 12' link inside MY BOARDS' empty state. Updated
subtitle and summary counts to reflect the new gap.

Co-Authored-By: Claude Opus 4.7 <noreply@anthropic.com>
</commit_message>
<xml_diff>
--- a/docs/qa-comparison/home-page-qa-round2.docx
+++ b/docs/qa-comparison/home-page-qa-round2.docx
@@ -55,7 +55,7 @@
           <w:color w:val="5A5A5A"/>
           <w:sz w:val="24"/>
         </w:rPr>
-        <w:t>Round 2 status against the Round 1 punch list. Counts: 3 done, 2 still open, 1 acceptable (no action needed). The big remaining gap is the My Tasks card structure (items #1 and #2 are tightly coupled; fixing the data grouping likely fixes both).</w:t>
+        <w:t>Round 2 status against the Round 1 punch list. Counts: 3 done, 3 still open (one new), 1 acceptable. The big remaining gap is the My Tasks card structure (items #1 and #2 are tightly coupled; fixing the data grouping likely fixes both). New round 2 gap: MY PROJECTS coexists with MY BOARDS, undermining the favoriting model.</w:t>
       </w:r>
     </w:p>
     <w:p>
@@ -68,7 +68,7 @@
           <w:color w:val="5A5A5A"/>
           <w:sz w:val="22"/>
         </w:rPr>
-        <w:t>Round 1 items: 3 done · 0 partial · 2 open · 1 acceptable</w:t>
+        <w:t>Round 1 items: 3 done · 0 partial · 3 open · 1 acceptable</w:t>
       </w:r>
     </w:p>
     <w:p>
@@ -458,6 +458,198 @@
         <w:spacing w:after="40"/>
       </w:pPr>
     </w:p>
+    <w:tbl>
+      <w:tblPr>
+        <w:tblW w:type="auto" w:w="0"/>
+        <w:tblLayout w:type="fixed"/>
+        <w:tblLook w:firstColumn="1" w:firstRow="1" w:lastColumn="0" w:lastRow="0" w:noHBand="0" w:noVBand="1" w:val="04A0"/>
+      </w:tblPr>
+      <w:tblGrid>
+        <w:gridCol w:w="792"/>
+        <w:gridCol w:w="1224"/>
+        <w:gridCol w:w="648"/>
+        <w:gridCol w:w="7416"/>
+      </w:tblGrid>
+      <w:tr>
+        <w:trPr>
+          <w:trHeight w:val="312"/>
+        </w:trPr>
+        <w:tc>
+          <w:tcPr>
+            <w:tcW w:type="dxa" w:w="792"/>
+            <w:tcBorders>
+              <w:top w:val="nil"/>
+              <w:left w:val="nil"/>
+              <w:bottom w:val="nil"/>
+              <w:right w:val="nil"/>
+            </w:tcBorders>
+            <w:shd w:val="clear" w:color="auto" w:fill="D69D2A"/>
+            <w:vAlign w:val="center"/>
+          </w:tcPr>
+          <w:p>
+            <w:pPr>
+              <w:spacing w:after="0"/>
+              <w:jc w:val="center"/>
+            </w:pPr>
+            <w:r>
+              <w:rPr>
+                <w:b/>
+                <w:color w:val="FFFFFF"/>
+                <w:sz w:val="16"/>
+              </w:rPr>
+              <w:t>MED</w:t>
+            </w:r>
+          </w:p>
+        </w:tc>
+        <w:tc>
+          <w:tcPr>
+            <w:tcW w:type="dxa" w:w="1224"/>
+            <w:tcBorders>
+              <w:top w:val="nil"/>
+              <w:left w:val="nil"/>
+              <w:bottom w:val="nil"/>
+              <w:right w:val="nil"/>
+            </w:tcBorders>
+            <w:shd w:val="clear" w:color="auto" w:fill="D33B3B"/>
+            <w:vAlign w:val="center"/>
+          </w:tcPr>
+          <w:p>
+            <w:pPr>
+              <w:spacing w:after="0"/>
+              <w:jc w:val="center"/>
+            </w:pPr>
+            <w:r>
+              <w:rPr>
+                <w:b/>
+                <w:color w:val="FFFFFF"/>
+                <w:sz w:val="16"/>
+              </w:rPr>
+              <w:t>OPEN</w:t>
+            </w:r>
+          </w:p>
+        </w:tc>
+        <w:tc>
+          <w:tcPr>
+            <w:tcW w:type="dxa" w:w="648"/>
+            <w:tcBorders>
+              <w:top w:val="nil"/>
+              <w:left w:val="nil"/>
+              <w:bottom w:val="nil"/>
+              <w:right w:val="nil"/>
+            </w:tcBorders>
+            <w:shd w:val="clear" w:color="auto" w:fill="0077C8"/>
+            <w:vAlign w:val="center"/>
+          </w:tcPr>
+          <w:p>
+            <w:pPr>
+              <w:spacing w:after="0"/>
+              <w:jc w:val="center"/>
+            </w:pPr>
+            <w:r>
+              <w:rPr>
+                <w:b/>
+                <w:color w:val="FFFFFF"/>
+                <w:sz w:val="16"/>
+              </w:rPr>
+              <w:t>NEW</w:t>
+            </w:r>
+          </w:p>
+        </w:tc>
+        <w:tc>
+          <w:tcPr>
+            <w:tcW w:type="dxa" w:w="7416"/>
+            <w:tcBorders>
+              <w:top w:val="nil"/>
+              <w:left w:val="nil"/>
+              <w:bottom w:val="nil"/>
+              <w:right w:val="nil"/>
+            </w:tcBorders>
+            <w:vAlign w:val="center"/>
+          </w:tcPr>
+          <w:p>
+            <w:pPr>
+              <w:spacing w:after="0"/>
+            </w:pPr>
+            <w:r>
+              <w:rPr>
+                <w:b/>
+                <w:color w:val="1A1A1A"/>
+                <w:sz w:val="22"/>
+              </w:rPr>
+              <w:t>#7. MY PROJECTS section duplicates MY BOARDS purpose</w:t>
+            </w:r>
+          </w:p>
+        </w:tc>
+      </w:tr>
+    </w:tbl>
+    <w:p>
+      <w:pPr>
+        <w:spacing w:after="60"/>
+        <w:ind w:left="230"/>
+      </w:pPr>
+      <w:r>
+        <w:rPr>
+          <w:b/>
+          <w:color w:val="1A1A1A"/>
+          <w:sz w:val="20"/>
+        </w:rPr>
+        <w:t xml:space="preserve">Round 1: </w:t>
+      </w:r>
+      <w:r>
+        <w:rPr>
+          <w:color w:val="1A1A1A"/>
+          <w:sz w:val="20"/>
+        </w:rPr>
+        <w:t>Not flagged in Round 1 (MY BOARDS hadn't shipped yet, so the coexistence wasn't visible).</w:t>
+      </w:r>
+    </w:p>
+    <w:p>
+      <w:pPr>
+        <w:spacing w:after="60"/>
+        <w:ind w:left="230"/>
+      </w:pPr>
+      <w:r>
+        <w:rPr>
+          <w:b/>
+          <w:color w:val="1A1A1A"/>
+          <w:sz w:val="20"/>
+        </w:rPr>
+        <w:t xml:space="preserve">Round 2: </w:t>
+      </w:r>
+      <w:r>
+        <w:rPr>
+          <w:color w:val="1A1A1A"/>
+          <w:sz w:val="20"/>
+        </w:rPr>
+        <w:t>Now that MY BOARDS shipped (item #4), MY PROJECTS still sits below it showing all 12 active projects with horizontal scroll. The two sections do similar things from the user's view ("quick access to project boards") but MY PROJECTS bypasses the curation MY BOARDS was built around. With both visible, there's no reason for a user to favorite anything: MY PROJECTS already shows everything. Our build has only MY BOARDS for this reason.</w:t>
+      </w:r>
+    </w:p>
+    <w:p>
+      <w:pPr>
+        <w:spacing w:after="60"/>
+        <w:ind w:left="230"/>
+      </w:pPr>
+      <w:r>
+        <w:rPr>
+          <w:b/>
+          <w:color w:val="1A1A1A"/>
+          <w:sz w:val="20"/>
+        </w:rPr>
+        <w:t xml:space="preserve">What's left: </w:t>
+      </w:r>
+      <w:r>
+        <w:rPr>
+          <w:color w:val="1A1A1A"/>
+          <w:sz w:val="20"/>
+        </w:rPr>
+        <w:t>Remove the MY PROJECTS section from the home page. MY BOARDS is the canonical "quick access to a board" surface; users curate which boards land there by tapping the star on a service. The full project list still lives one click away on the Clients page. If leadership wants a 'see everything' fallback, build it as an empty-state link inside MY BOARDS ("Don't have favorites yet? See all 12 projects") rather than a parallel section.</w:t>
+      </w:r>
+    </w:p>
+    <w:p>
+      <w:pPr>
+        <w:spacing w:after="40"/>
+      </w:pPr>
+    </w:p>
     <w:p>
       <w:pPr>
         <w:spacing w:before="280" w:after="80"/>
@@ -769,7 +961,7 @@
           <w:color w:val="1A1A1A"/>
           <w:sz w:val="20"/>
         </w:rPr>
-        <w:t>Portal now shows the MY BOARDS section under My Schedule, with the same empty-state copy and CTA. MY PROJECTS still exists below it (both sections coexist). Done.</w:t>
+        <w:t>Portal now shows the MY BOARDS section under My Schedule, with the same empty-state copy and CTA. MY BOARDS itself is done. The MY PROJECTS coexistence below it is tracked separately as item #7.</w:t>
       </w:r>
     </w:p>
     <w:p>
@@ -1366,6 +1558,122 @@
         <w:spacing w:after="80"/>
       </w:pPr>
     </w:p>
+    <w:tbl>
+      <w:tblPr>
+        <w:tblW w:type="auto" w:w="0"/>
+        <w:tblLayout w:type="fixed"/>
+        <w:tblLook w:firstColumn="1" w:firstRow="1" w:lastColumn="0" w:lastRow="0" w:noHBand="0" w:noVBand="1" w:val="04A0"/>
+      </w:tblPr>
+      <w:tblGrid>
+        <w:gridCol w:w="461"/>
+        <w:gridCol w:w="792"/>
+        <w:gridCol w:w="8539"/>
+      </w:tblGrid>
+      <w:tr>
+        <w:tc>
+          <w:tcPr>
+            <w:tcW w:type="dxa" w:w="461"/>
+            <w:tcBorders>
+              <w:top w:val="nil"/>
+              <w:left w:val="nil"/>
+              <w:bottom w:val="nil"/>
+              <w:right w:val="nil"/>
+            </w:tcBorders>
+            <w:vAlign w:val="top"/>
+          </w:tcPr>
+          <w:p>
+            <w:pPr>
+              <w:spacing w:after="0"/>
+            </w:pPr>
+            <w:sdt>
+              <w:sdtPr>
+                <w14:checkbox>
+                  <w14:checked w14:val="0"/>
+                  <w14:checkedState w14:val="2612" w14:font="MS Gothic"/>
+                  <w14:uncheckedState w14:val="2610" w14:font="MS Gothic"/>
+                </w14:checkbox>
+              </w:sdtPr>
+              <w:sdtContent>
+                <w:r>
+                  <w:rPr>
+                    <w:rFonts w:ascii="MS Gothic" w:hAnsi="MS Gothic" w:eastAsia="MS Gothic"/>
+                    <w:sz w:val="24"/>
+                  </w:rPr>
+                  <w:t>☐</w:t>
+                </w:r>
+              </w:sdtContent>
+            </w:sdt>
+          </w:p>
+        </w:tc>
+        <w:tc>
+          <w:tcPr>
+            <w:tcW w:type="dxa" w:w="792"/>
+            <w:tcBorders>
+              <w:top w:val="nil"/>
+              <w:left w:val="nil"/>
+              <w:bottom w:val="nil"/>
+              <w:right w:val="nil"/>
+            </w:tcBorders>
+            <w:shd w:val="clear" w:color="auto" w:fill="D69D2A"/>
+            <w:vAlign w:val="top"/>
+          </w:tcPr>
+          <w:p>
+            <w:pPr>
+              <w:spacing w:after="0"/>
+              <w:jc w:val="center"/>
+            </w:pPr>
+            <w:r>
+              <w:rPr>
+                <w:b/>
+                <w:color w:val="FFFFFF"/>
+                <w:sz w:val="16"/>
+              </w:rPr>
+              <w:t>MED</w:t>
+            </w:r>
+          </w:p>
+        </w:tc>
+        <w:tc>
+          <w:tcPr>
+            <w:tcW w:type="dxa" w:w="8539"/>
+            <w:tcBorders>
+              <w:top w:val="nil"/>
+              <w:left w:val="nil"/>
+              <w:bottom w:val="nil"/>
+              <w:right w:val="nil"/>
+            </w:tcBorders>
+            <w:vAlign w:val="top"/>
+          </w:tcPr>
+          <w:p>
+            <w:pPr>
+              <w:spacing w:after="0"/>
+            </w:pPr>
+            <w:r>
+              <w:rPr>
+                <w:b/>
+                <w:color w:val="1A1A1A"/>
+                <w:sz w:val="21"/>
+              </w:rPr>
+              <w:t>#7. MY PROJECTS section duplicates MY BOARDS purpose</w:t>
+            </w:r>
+            <w:r>
+              <w:br/>
+            </w:r>
+            <w:r>
+              <w:rPr>
+                <w:color w:val="1A1A1A"/>
+                <w:sz w:val="20"/>
+              </w:rPr>
+              <w:t>Remove the MY PROJECTS section from the home page. MY BOARDS is the canonical "quick access to a board" surface; users curate which boards land there by tapping the star on a service. The full project list still lives one click away on the Clients page. If leadership wants a 'see everything' fallback, build it as an empty-state link inside MY BOARDS ("Don't have favorites yet? See all 12 projects") rather than a parallel section.</w:t>
+            </w:r>
+          </w:p>
+        </w:tc>
+      </w:tr>
+    </w:tbl>
+    <w:p>
+      <w:pPr>
+        <w:spacing w:after="80"/>
+      </w:pPr>
+    </w:p>
     <w:sectPr>
       <w:pgSz w:w="12240" w:h="15840"/>
       <w:pgMar w:top="1224" w:right="1080" w:bottom="1080" w:left="1080" w:header="720" w:footer="720" w:gutter="0"/>

</xml_diff>